<commit_message>
fix(editorial): resolve contrast issues, eliminate duplicate tables, and optimize Quick Stats to 3 curated dimensions across all guides
</commit_message>
<xml_diff>
--- a/content-pipeline/06-word-documents/01-vietnamese-word/001_dia-diem-noi-tieng-quanh-ben-thanh.docx
+++ b/content-pipeline/06-word-documents/01-vietnamese-word/001_dia-diem-noi-tieng-quanh-ben-thanh.docx
@@ -156,275 +156,6 @@
         </w:rPr>
         <w:t xml:space="preserve"> của đô thị Sài Gòn – Thành phố Hồ Chí Minh. Trong bán kính tản bộ chỉ từ 300m đến 1.200m tính từ tháp đồng hồ bốn mặt trứ danh, du khách sẽ bắt gặp sự giao thoa kỳ diệu giữa ba lớp trầm tích: kiến trúc thời thuộc địa đầu thế kỷ 20, những công trình kiến trúc Hiện đại nhiệt đới thời kỳ đỉnh cao, và hệ thống hạ tầng ngầm đô thị tương lai vừa chính thức định hình diện mạo mới vào năm 2026.</w:t>
       </w:r>
-    </w:p>
-    <w:p>
-      <w:pPr>
-        <w:spacing w:before="120" w:after="120"/>
-        <w:jc w:val="center"/>
-      </w:pPr>
-      <w:r>
-        <w:rPr>
-          <w:color w:val="CBD5E1"/>
-        </w:rPr>
-        <w:t>―――――――――――――――――――――――――――――――――――――――――――――</w:t>
-      </w:r>
-    </w:p>
-    <w:p>
-      <w:pPr>
-        <w:keepNext/>
-        <w:spacing w:before="320" w:after="120" w:line="276" w:lineRule="auto"/>
-      </w:pPr>
-      <w:r>
-        <w:rPr>
-          <w:rFonts w:ascii="Calibri" w:hAnsi="Calibri"/>
-          <w:b/>
-          <w:color w:val="1B365D"/>
-          <w:sz w:val="32"/>
-        </w:rPr>
-        <w:t>Quick Overview Stats Bar (Thông Số Thực Địa 2026)</w:t>
-      </w:r>
-    </w:p>
-    <w:tbl>
-      <w:tblPr>
-        <w:tblW w:type="auto" w:w="0"/>
-        <w:jc w:val="center"/>
-        <w:tblLook w:firstColumn="1" w:firstRow="1" w:lastColumn="0" w:lastRow="0" w:noHBand="0" w:noVBand="1" w:val="04A0"/>
-        <w:tblBorders>
-          <w:top w:val="single" w:sz="4" w:space="0" w:color="CBD5E1"/>
-          <w:bottom w:val="single" w:sz="6" w:space="0" w:color="1B365D"/>
-          <w:left w:val="none"/>
-          <w:right w:val="none"/>
-          <w:insideH w:val="single" w:sz="4" w:space="0" w:color="CBD5E1"/>
-          <w:insideV w:val="none"/>
-        </w:tblBorders>
-      </w:tblPr>
-      <w:tblGrid>
-        <w:gridCol w:w="2484"/>
-        <w:gridCol w:w="2484"/>
-        <w:gridCol w:w="2484"/>
-        <w:gridCol w:w="2484"/>
-      </w:tblGrid>
-      <w:tr>
-        <w:tc>
-          <w:tcPr>
-            <w:tcW w:type="dxa" w:w="2484"/>
-            <w:vAlign w:val="center"/>
-            <w:shd w:fill="1B365D"/>
-            <w:tcMar>
-              <w:top w:w="140" w:type="dxa"/>
-              <w:bottom w:w="140" w:type="dxa"/>
-              <w:left w:w="150" w:type="dxa"/>
-              <w:right w:w="150" w:type="dxa"/>
-            </w:tcMar>
-          </w:tcPr>
-          <w:p>
-            <w:pPr>
-              <w:spacing w:before="0" w:after="0" w:line="276" w:lineRule="auto"/>
-            </w:pPr>
-            <w:r>
-              <w:rPr>
-                <w:rFonts w:ascii="Calibri" w:hAnsi="Calibri"/>
-                <w:b/>
-                <w:color w:val="FFFFFF"/>
-                <w:sz w:val="19"/>
-              </w:rPr>
-              <w:t>📍 Tọa độ trung tâm</w:t>
-            </w:r>
-          </w:p>
-        </w:tc>
-        <w:tc>
-          <w:tcPr>
-            <w:tcW w:type="dxa" w:w="2484"/>
-            <w:vAlign w:val="center"/>
-            <w:shd w:fill="1B365D"/>
-            <w:tcMar>
-              <w:top w:w="140" w:type="dxa"/>
-              <w:bottom w:w="140" w:type="dxa"/>
-              <w:left w:w="150" w:type="dxa"/>
-              <w:right w:w="150" w:type="dxa"/>
-            </w:tcMar>
-          </w:tcPr>
-          <w:p>
-            <w:pPr>
-              <w:spacing w:before="0" w:after="0" w:line="276" w:lineRule="auto"/>
-            </w:pPr>
-            <w:r>
-              <w:rPr>
-                <w:rFonts w:ascii="Calibri" w:hAnsi="Calibri"/>
-                <w:b/>
-                <w:color w:val="FFFFFF"/>
-                <w:sz w:val="19"/>
-              </w:rPr>
-              <w:t>⏳ Khởi nguồn lịch sử</w:t>
-            </w:r>
-          </w:p>
-        </w:tc>
-        <w:tc>
-          <w:tcPr>
-            <w:tcW w:type="dxa" w:w="2484"/>
-            <w:vAlign w:val="center"/>
-            <w:shd w:fill="1B365D"/>
-            <w:tcMar>
-              <w:top w:w="140" w:type="dxa"/>
-              <w:bottom w:w="140" w:type="dxa"/>
-              <w:left w:w="150" w:type="dxa"/>
-              <w:right w:w="150" w:type="dxa"/>
-            </w:tcMar>
-          </w:tcPr>
-          <w:p>
-            <w:pPr>
-              <w:spacing w:before="0" w:after="0" w:line="276" w:lineRule="auto"/>
-            </w:pPr>
-            <w:r>
-              <w:rPr>
-                <w:rFonts w:ascii="Calibri" w:hAnsi="Calibri"/>
-                <w:b/>
-                <w:color w:val="FFFFFF"/>
-                <w:sz w:val="19"/>
-              </w:rPr>
-              <w:t>🚶 Bán kính khám phá</w:t>
-            </w:r>
-          </w:p>
-        </w:tc>
-        <w:tc>
-          <w:tcPr>
-            <w:tcW w:type="dxa" w:w="2484"/>
-            <w:vAlign w:val="center"/>
-            <w:shd w:fill="1B365D"/>
-            <w:tcMar>
-              <w:top w:w="140" w:type="dxa"/>
-              <w:bottom w:w="140" w:type="dxa"/>
-              <w:left w:w="150" w:type="dxa"/>
-              <w:right w:w="150" w:type="dxa"/>
-            </w:tcMar>
-          </w:tcPr>
-          <w:p>
-            <w:pPr>
-              <w:spacing w:before="0" w:after="0" w:line="276" w:lineRule="auto"/>
-            </w:pPr>
-            <w:r>
-              <w:rPr>
-                <w:rFonts w:ascii="Calibri" w:hAnsi="Calibri"/>
-                <w:b/>
-                <w:color w:val="FFFFFF"/>
-                <w:sz w:val="19"/>
-              </w:rPr>
-              <w:t>🎟️ Thời giá tham quan 2026</w:t>
-            </w:r>
-          </w:p>
-        </w:tc>
-      </w:tr>
-      <w:tr>
-        <w:tc>
-          <w:tcPr>
-            <w:tcW w:type="dxa" w:w="2484"/>
-            <w:vAlign w:val="center"/>
-            <w:shd w:fill="F8FAFC"/>
-            <w:tcMar>
-              <w:top w:w="100" w:type="dxa"/>
-              <w:bottom w:w="100" w:type="dxa"/>
-              <w:left w:w="150" w:type="dxa"/>
-              <w:right w:w="150" w:type="dxa"/>
-            </w:tcMar>
-          </w:tcPr>
-          <w:p>
-            <w:pPr>
-              <w:spacing w:before="0" w:after="0" w:line="276" w:lineRule="auto"/>
-            </w:pPr>
-            <w:r>
-              <w:rPr>
-                <w:rFonts w:ascii="Calibri" w:hAnsi="Calibri"/>
-                <w:color w:val="1E293B"/>
-                <w:sz w:val="19"/>
-              </w:rPr>
-              <w:t>Quảng trường Quách Thị Trang, Phường Bến Thành, Quận 1</w:t>
-            </w:r>
-          </w:p>
-        </w:tc>
-        <w:tc>
-          <w:tcPr>
-            <w:tcW w:type="dxa" w:w="2484"/>
-            <w:vAlign w:val="center"/>
-            <w:shd w:fill="F8FAFC"/>
-            <w:tcMar>
-              <w:top w:w="100" w:type="dxa"/>
-              <w:bottom w:w="100" w:type="dxa"/>
-              <w:left w:w="150" w:type="dxa"/>
-              <w:right w:w="150" w:type="dxa"/>
-            </w:tcMar>
-          </w:tcPr>
-          <w:p>
-            <w:pPr>
-              <w:spacing w:before="0" w:after="0" w:line="276" w:lineRule="auto"/>
-            </w:pPr>
-            <w:r>
-              <w:rPr>
-                <w:rFonts w:ascii="Calibri" w:hAnsi="Calibri"/>
-                <w:color w:val="1E293B"/>
-                <w:sz w:val="19"/>
-              </w:rPr>
-              <w:t>1914 (Khánh thành Chợ Mới Bến Thành)</w:t>
-            </w:r>
-          </w:p>
-        </w:tc>
-        <w:tc>
-          <w:tcPr>
-            <w:tcW w:type="dxa" w:w="2484"/>
-            <w:vAlign w:val="center"/>
-            <w:shd w:fill="F8FAFC"/>
-            <w:tcMar>
-              <w:top w:w="100" w:type="dxa"/>
-              <w:bottom w:w="100" w:type="dxa"/>
-              <w:left w:w="150" w:type="dxa"/>
-              <w:right w:w="150" w:type="dxa"/>
-            </w:tcMar>
-          </w:tcPr>
-          <w:p>
-            <w:pPr>
-              <w:spacing w:before="0" w:after="0" w:line="276" w:lineRule="auto"/>
-            </w:pPr>
-            <w:r>
-              <w:rPr>
-                <w:rFonts w:ascii="Calibri" w:hAnsi="Calibri"/>
-                <w:color w:val="1E293B"/>
-                <w:sz w:val="19"/>
-              </w:rPr>
-              <w:t>1.2 km (Tản bộ lý tưởng)</w:t>
-            </w:r>
-          </w:p>
-        </w:tc>
-        <w:tc>
-          <w:tcPr>
-            <w:tcW w:type="dxa" w:w="2484"/>
-            <w:vAlign w:val="center"/>
-            <w:shd w:fill="F8FAFC"/>
-            <w:tcMar>
-              <w:top w:w="100" w:type="dxa"/>
-              <w:bottom w:w="100" w:type="dxa"/>
-              <w:left w:w="150" w:type="dxa"/>
-              <w:right w:w="150" w:type="dxa"/>
-            </w:tcMar>
-          </w:tcPr>
-          <w:p>
-            <w:pPr>
-              <w:spacing w:before="0" w:after="0" w:line="276" w:lineRule="auto"/>
-            </w:pPr>
-            <w:r>
-              <w:rPr>
-                <w:rFonts w:ascii="Calibri" w:hAnsi="Calibri"/>
-                <w:color w:val="1E293B"/>
-                <w:sz w:val="19"/>
-              </w:rPr>
-              <w:t>0 – 65.000 VNĐ / điểm đến</w:t>
-            </w:r>
-          </w:p>
-        </w:tc>
-      </w:tr>
-    </w:tbl>
-    <w:p>
-      <w:pPr>
-        <w:spacing w:before="0" w:after="80"/>
-      </w:pPr>
     </w:p>
     <w:p>
       <w:pPr>

</xml_diff>